<commit_message>
Align Zucrow reflection with lecture slides and correct the funding timeline
Co-authored-by: fatimai146 <fatimai146@users.noreply.github.com>
</commit_message>
<xml_diff>
--- a/Reflection_Paper_Sept24_Robert_Lucht.docx
+++ b/Reflection_Paper_Sept24_Robert_Lucht.docx
@@ -17,7 +17,7 @@
         <w:ind w:firstLine="720"/>
       </w:pPr>
       <w:r>
-        <w:t>The part of this lecture that changed how I think about education was not the engine diagram. It was the long stretch when Zucrow was quiet. Dr. Lucht earned his PhD there, left, and came back about two decades later to find that the gas turbine effort had largely faded after the faculty who led it left. A laboratory is not a permanent asset. It is a capability, and it dies when the people and the equipment are not renewed. When the new combustion building opened in 2016, he said the number of graduate students roughly doubled within a few years. That is the education point I cannot shake. We talk as if teaching capacity lives in the curriculum. Here it lived in square footage and air supply. Purdue did not double how many people could learn this work by adding a course. It doubled it by adding a building.</w:t>
+        <w:t>The part of this lecture that changed how I think about education was not the engine diagram. It was how long the lab spent physically stuck. After a two million dollar state grant in the early 2000s restarted propulsion work, gas turbine testing and rocket testing each lived in a single 500 square foot cell for about a decade. Steve Heister became director in 2011 and started raising money for a real combustion lab. Mitch Daniels toured in 2015 and convinced the Lilly Endowment to put five million dollars toward what became ZL8. When that building opened in 2016, research spending and the graduate student count had both doubled by 2020. That is the education point I cannot shake. We talk as if teaching capacity lives in the curriculum. Here it lived in square footage. Purdue did not double how many people could learn this work by adding a course. It doubled it by adding a building.</w:t>
       </w:r>
     </w:p>
     <w:p>
@@ -43,7 +43,7 @@
         <w:ind w:firstLine="720"/>
       </w:pPr>
       <w:r>
-        <w:t>What surprised me is how much of this story is a capital allocation story. A relatively small state investment in the early 2000s, with backing from Rolls Royce in Indianapolis, restarted work that had gone quiet. A visit from Mitch Daniels helped unlock a private endowment gift, and the building that opened in 2016 roughly doubled research spending. Rolls Royce was then rebuilding test capacity it had let fall behind competitors, and Purdue wanted part of that relationship in West Lafayette. The first version of the deal was a modest university building aimed at one engine program. Dr. Lucht and Scott Meyer, the managing director, argued that a single test cell for a single customer was a poor use of the money. The first design priced out too high, so they redesigned it, and the building dedicated in fall 2024 is already full enough that he has to referee which faculty get the space.</w:t>
+        <w:t>What surprised me is how much of this story is a capital allocation story. The early 2000s restart was a small state grant. The 2016 building followed a campus tour and an endowment gift. The larger jump started around 2020, when Rolls Royce was upgrading test facilities worldwide, including Indianapolis plants that dated to just after World War II, and Purdue wanted part of that work in West Lafayette. The opening offer was at least twenty five million dollars so Zucrow could run full annular tests of regional jet engines. Dr. Lucht and Scott Meyer argued that a larger building, with a new high pressure air plant, was the better use of the chance. They presented a business plan, the project was approved at seventy million dollars, and another three million was added after nickel prices spiked when Russia invaded Ukraine. The building was dedicated in fall 2024. It is still coming online through the end of 2026, and the spaces are already fully occupied by funded projects. Demand arrived before the lab was finished.</w:t>
       </w:r>
     </w:p>
     <w:p>
@@ -95,7 +95,7 @@
         <w:ind w:firstLine="720"/>
       </w:pPr>
       <w:r>
-        <w:t>I expected a tour of rockets. What I got was a lesson in what it takes to keep a capability alive. Dr. Lucht joked that one of a director's main jobs is to keep telling the university the lab needs facilities and people. For years the place was easy to ignore. Now they give tours almost every day, and they are already turning work down for lack of space and air. The detail I will remember is that ten dollar tunnel, useful again because laser diagnostics have moved on since the 1980s and because a university was willing to own something a contractor would not. The thing that decides whether the science happens is mundane: air tanks, electricity rates, a sponsor in the control room, and someone willing to fight for the building. That is the part someone in my program can actually contribute to.</w:t>
+        <w:t>I expected a tour of rockets. What I got was a lesson in what it takes to keep a capability alive. Dr. Lucht joked that one of a director's main jobs is to keep telling the university the lab needs facilities and people. For years the place was easy to ignore. Now they give tours almost every day, and a building that will not be fully operational until the end of 2026 already has its spaces spoken for. The detail I will remember is that ten dollar tunnel, useful again because laser diagnostics have moved on since the 1980s and because a university was willing to own something a contractor would not. The thing that decides whether the science happens is mundane: air tanks, electricity rates, a sponsor in the control room, and someone willing to fight for the building. That is the part someone in my program can actually contribute to.</w:t>
       </w:r>
     </w:p>
     <w:sectPr>

</xml_diff>